<commit_message>
docs: anadir a Yimmy Lijeron Mejia como postulante en toda la documentacion
</commit_message>
<xml_diff>
--- a/documentacion/Monografia_EncuentraMiMascota.docx
+++ b/documentacion/Monografia_EncuentraMiMascota.docx
@@ -267,7 +267,7 @@
         <w:tc>
           <w:p>
             <w:pPr>
-              <w:spacing w:after="100" w:before="100"/>
+              <w:spacing w:after="40" w:before="80"/>
             </w:pPr>
             <w:r>
               <w:rPr>
@@ -276,7 +276,21 @@
                 <w:sz w:val="24"/>
                 <w:szCs w:val="24"/>
               </w:rPr>
-              <w:t xml:space="preserve">Ditetter Leon Justiniano</w:t>
+              <w:t xml:space="preserve">Leon Justiniano</w:t>
+            </w:r>
+          </w:p>
+          <w:p>
+            <w:pPr>
+              <w:spacing w:after="80" w:before="40"/>
+            </w:pPr>
+            <w:r>
+              <w:rPr>
+                <w:rFonts w:ascii="Calibri" w:cs="Calibri" w:eastAsia="Calibri" w:hAnsi="Calibri"/>
+                <w:color w:val="000000"/>
+                <w:sz w:val="24"/>
+                <w:szCs w:val="24"/>
+              </w:rPr>
+              <w:t xml:space="preserve">Yimmy Lijeron Mejia</w:t>
             </w:r>
           </w:p>
         </w:tc>
@@ -3613,7 +3627,7 @@
                 <w:sz w:val="24"/>
                 <w:szCs w:val="24"/>
               </w:rPr>
-              <w:t xml:space="preserve">Ditetter Leon Justiniano</w:t>
+              <w:t xml:space="preserve">Leon Justiniano</w:t>
             </w:r>
           </w:p>
         </w:tc>
@@ -3634,7 +3648,51 @@
                 <w:sz w:val="24"/>
                 <w:szCs w:val="24"/>
               </w:rPr>
-              <w:t xml:space="preserve">Estudiante postulante – Análisis, diseño, desarrollo y pruebas del sistema web</w:t>
+              <w:t xml:space="preserve">Estudiante postulante – Análisis, diseño, desarrollo frontend/backend y pruebas</w:t>
+            </w:r>
+          </w:p>
+        </w:tc>
+      </w:tr>
+      <w:tr>
+        <w:tc>
+          <w:p>
+            <w:pPr>
+              <w:spacing w:after="120" w:before="0" w:line="276"/>
+              <w:jc w:val="both"/>
+            </w:pPr>
+            <w:r>
+              <w:rPr>
+                <w:rFonts w:ascii="Calibri" w:cs="Calibri" w:eastAsia="Calibri" w:hAnsi="Calibri"/>
+                <w:b/>
+                <w:bCs/>
+                <w:i w:val="false"/>
+                <w:iCs w:val="false"/>
+                <w:color w:val="1A1A1A"/>
+                <w:sz w:val="24"/>
+                <w:szCs w:val="24"/>
+              </w:rPr>
+              <w:t xml:space="preserve">Yimmy Lijeron Mejia</w:t>
+            </w:r>
+          </w:p>
+        </w:tc>
+        <w:tc>
+          <w:p>
+            <w:pPr>
+              <w:spacing w:after="120" w:before="0" w:line="276"/>
+              <w:jc w:val="both"/>
+            </w:pPr>
+            <w:r>
+              <w:rPr>
+                <w:rFonts w:ascii="Calibri" w:cs="Calibri" w:eastAsia="Calibri" w:hAnsi="Calibri"/>
+                <w:b w:val="false"/>
+                <w:bCs w:val="false"/>
+                <w:i w:val="false"/>
+                <w:iCs w:val="false"/>
+                <w:color w:val="1A1A1A"/>
+                <w:sz w:val="24"/>
+                <w:szCs w:val="24"/>
+              </w:rPr>
+              <w:t xml:space="preserve">Estudiante postulante – Análisis de requerimientos, diseño UI/UX, desarrollo y documentación</w:t>
             </w:r>
           </w:p>
         </w:tc>

</xml_diff>